<commit_message>
Compress Week 3 report for portal upload
</commit_message>
<xml_diff>
--- a/reports/Week3_Clustering_Analysis_Report.docx
+++ b/reports/Week3_Clustering_Analysis_Report.docx
@@ -2816,7 +2816,7 @@
       <w:r>
         <w:drawing>
           <wp:inline xmlns:a="http://schemas.openxmlformats.org/drawingml/2006/main" xmlns:pic="http://schemas.openxmlformats.org/drawingml/2006/picture">
-            <wp:extent cx="5486400" cy="3430515"/>
+            <wp:extent cx="5486400" cy="3431838"/>
             <wp:docPr id="1" name="Picture 1"/>
             <wp:cNvGraphicFramePr>
               <a:graphicFrameLocks noChangeAspect="1"/>
@@ -2825,7 +2825,7 @@
               <a:graphicData uri="http://schemas.openxmlformats.org/drawingml/2006/picture">
                 <pic:pic>
                   <pic:nvPicPr>
-                    <pic:cNvPr id="0" name="w3_movie_01_elbow.png"/>
+                    <pic:cNvPr id="0" name="image.jpg"/>
                     <pic:cNvPicPr/>
                   </pic:nvPicPr>
                   <pic:blipFill>
@@ -2837,7 +2837,7 @@
                   <pic:spPr>
                     <a:xfrm>
                       <a:off x="0" y="0"/>
-                      <a:ext cx="5486400" cy="3430515"/>
+                      <a:ext cx="5486400" cy="3431838"/>
                     </a:xfrm>
                     <a:prstGeom prst="rect"/>
                   </pic:spPr>
@@ -2890,7 +2890,7 @@
       <w:r>
         <w:drawing>
           <wp:inline xmlns:a="http://schemas.openxmlformats.org/drawingml/2006/main" xmlns:pic="http://schemas.openxmlformats.org/drawingml/2006/picture">
-            <wp:extent cx="5486400" cy="3430515"/>
+            <wp:extent cx="5486400" cy="3431838"/>
             <wp:docPr id="2" name="Picture 2"/>
             <wp:cNvGraphicFramePr>
               <a:graphicFrameLocks noChangeAspect="1"/>
@@ -2899,7 +2899,7 @@
               <a:graphicData uri="http://schemas.openxmlformats.org/drawingml/2006/picture">
                 <pic:pic>
                   <pic:nvPicPr>
-                    <pic:cNvPr id="0" name="w3_tv_01_elbow.png"/>
+                    <pic:cNvPr id="0" name="image.jpg"/>
                     <pic:cNvPicPr/>
                   </pic:nvPicPr>
                   <pic:blipFill>
@@ -2911,7 +2911,7 @@
                   <pic:spPr>
                     <a:xfrm>
                       <a:off x="0" y="0"/>
-                      <a:ext cx="5486400" cy="3430515"/>
+                      <a:ext cx="5486400" cy="3431838"/>
                     </a:xfrm>
                     <a:prstGeom prst="rect"/>
                   </pic:spPr>
@@ -2992,7 +2992,7 @@
       <w:r>
         <w:drawing>
           <wp:inline xmlns:a="http://schemas.openxmlformats.org/drawingml/2006/main" xmlns:pic="http://schemas.openxmlformats.org/drawingml/2006/picture">
-            <wp:extent cx="5486400" cy="3493815"/>
+            <wp:extent cx="5486400" cy="3492377"/>
             <wp:docPr id="3" name="Picture 3"/>
             <wp:cNvGraphicFramePr>
               <a:graphicFrameLocks noChangeAspect="1"/>
@@ -3001,7 +3001,7 @@
               <a:graphicData uri="http://schemas.openxmlformats.org/drawingml/2006/picture">
                 <pic:pic>
                   <pic:nvPicPr>
-                    <pic:cNvPr id="0" name="w3_movie_02_silhouette.png"/>
+                    <pic:cNvPr id="0" name="image.jpg"/>
                     <pic:cNvPicPr/>
                   </pic:nvPicPr>
                   <pic:blipFill>
@@ -3013,7 +3013,7 @@
                   <pic:spPr>
                     <a:xfrm>
                       <a:off x="0" y="0"/>
-                      <a:ext cx="5486400" cy="3493815"/>
+                      <a:ext cx="5486400" cy="3492377"/>
                     </a:xfrm>
                     <a:prstGeom prst="rect"/>
                   </pic:spPr>
@@ -3066,7 +3066,7 @@
       <w:r>
         <w:drawing>
           <wp:inline xmlns:a="http://schemas.openxmlformats.org/drawingml/2006/main" xmlns:pic="http://schemas.openxmlformats.org/drawingml/2006/picture">
-            <wp:extent cx="5486400" cy="3536791"/>
+            <wp:extent cx="5486400" cy="3537782"/>
             <wp:docPr id="4" name="Picture 4"/>
             <wp:cNvGraphicFramePr>
               <a:graphicFrameLocks noChangeAspect="1"/>
@@ -3075,7 +3075,7 @@
               <a:graphicData uri="http://schemas.openxmlformats.org/drawingml/2006/picture">
                 <pic:pic>
                   <pic:nvPicPr>
-                    <pic:cNvPr id="0" name="w3_tv_02_silhouette.png"/>
+                    <pic:cNvPr id="0" name="image.jpg"/>
                     <pic:cNvPicPr/>
                   </pic:nvPicPr>
                   <pic:blipFill>
@@ -3087,7 +3087,7 @@
                   <pic:spPr>
                     <a:xfrm>
                       <a:off x="0" y="0"/>
-                      <a:ext cx="5486400" cy="3536791"/>
+                      <a:ext cx="5486400" cy="3537782"/>
                     </a:xfrm>
                     <a:prstGeom prst="rect"/>
                   </pic:spPr>
@@ -3140,7 +3140,7 @@
       <w:r>
         <w:drawing>
           <wp:inline xmlns:a="http://schemas.openxmlformats.org/drawingml/2006/main" xmlns:pic="http://schemas.openxmlformats.org/drawingml/2006/picture">
-            <wp:extent cx="5486400" cy="3199855"/>
+            <wp:extent cx="5486400" cy="3201031"/>
             <wp:docPr id="5" name="Picture 5"/>
             <wp:cNvGraphicFramePr>
               <a:graphicFrameLocks noChangeAspect="1"/>
@@ -3149,7 +3149,7 @@
               <a:graphicData uri="http://schemas.openxmlformats.org/drawingml/2006/picture">
                 <pic:pic>
                   <pic:nvPicPr>
-                    <pic:cNvPr id="0" name="w3_movie_03_db_ch.png"/>
+                    <pic:cNvPr id="0" name="image.jpg"/>
                     <pic:cNvPicPr/>
                   </pic:nvPicPr>
                   <pic:blipFill>
@@ -3161,7 +3161,7 @@
                   <pic:spPr>
                     <a:xfrm>
                       <a:off x="0" y="0"/>
-                      <a:ext cx="5486400" cy="3199855"/>
+                      <a:ext cx="5486400" cy="3201031"/>
                     </a:xfrm>
                     <a:prstGeom prst="rect"/>
                   </pic:spPr>
@@ -3214,7 +3214,7 @@
       <w:r>
         <w:drawing>
           <wp:inline xmlns:a="http://schemas.openxmlformats.org/drawingml/2006/main" xmlns:pic="http://schemas.openxmlformats.org/drawingml/2006/picture">
-            <wp:extent cx="5486400" cy="3199855"/>
+            <wp:extent cx="5486400" cy="3201031"/>
             <wp:docPr id="6" name="Picture 6"/>
             <wp:cNvGraphicFramePr>
               <a:graphicFrameLocks noChangeAspect="1"/>
@@ -3223,7 +3223,7 @@
               <a:graphicData uri="http://schemas.openxmlformats.org/drawingml/2006/picture">
                 <pic:pic>
                   <pic:nvPicPr>
-                    <pic:cNvPr id="0" name="w3_tv_03_db_ch.png"/>
+                    <pic:cNvPr id="0" name="image.jpg"/>
                     <pic:cNvPicPr/>
                   </pic:nvPicPr>
                   <pic:blipFill>
@@ -3235,7 +3235,7 @@
                   <pic:spPr>
                     <a:xfrm>
                       <a:off x="0" y="0"/>
-                      <a:ext cx="5486400" cy="3199855"/>
+                      <a:ext cx="5486400" cy="3201031"/>
                     </a:xfrm>
                     <a:prstGeom prst="rect"/>
                   </pic:spPr>
@@ -3785,7 +3785,7 @@
       <w:r>
         <w:drawing>
           <wp:inline xmlns:a="http://schemas.openxmlformats.org/drawingml/2006/main" xmlns:pic="http://schemas.openxmlformats.org/drawingml/2006/picture">
-            <wp:extent cx="5486400" cy="3198585"/>
+            <wp:extent cx="5486400" cy="3197247"/>
             <wp:docPr id="7" name="Picture 7"/>
             <wp:cNvGraphicFramePr>
               <a:graphicFrameLocks noChangeAspect="1"/>
@@ -3794,7 +3794,7 @@
               <a:graphicData uri="http://schemas.openxmlformats.org/drawingml/2006/picture">
                 <pic:pic>
                   <pic:nvPicPr>
-                    <pic:cNvPr id="0" name="w3_movie_04_cluster_sizes.png"/>
+                    <pic:cNvPr id="0" name="image.jpg"/>
                     <pic:cNvPicPr/>
                   </pic:nvPicPr>
                   <pic:blipFill>
@@ -3806,7 +3806,7 @@
                   <pic:spPr>
                     <a:xfrm>
                       <a:off x="0" y="0"/>
-                      <a:ext cx="5486400" cy="3198585"/>
+                      <a:ext cx="5486400" cy="3197247"/>
                     </a:xfrm>
                     <a:prstGeom prst="rect"/>
                   </pic:spPr>
@@ -3859,7 +3859,7 @@
       <w:r>
         <w:drawing>
           <wp:inline xmlns:a="http://schemas.openxmlformats.org/drawingml/2006/main" xmlns:pic="http://schemas.openxmlformats.org/drawingml/2006/picture">
-            <wp:extent cx="5486400" cy="3198585"/>
+            <wp:extent cx="5486400" cy="3197247"/>
             <wp:docPr id="8" name="Picture 8"/>
             <wp:cNvGraphicFramePr>
               <a:graphicFrameLocks noChangeAspect="1"/>
@@ -3868,7 +3868,7 @@
               <a:graphicData uri="http://schemas.openxmlformats.org/drawingml/2006/picture">
                 <pic:pic>
                   <pic:nvPicPr>
-                    <pic:cNvPr id="0" name="w3_tv_04_cluster_sizes.png"/>
+                    <pic:cNvPr id="0" name="image.jpg"/>
                     <pic:cNvPicPr/>
                   </pic:nvPicPr>
                   <pic:blipFill>
@@ -3880,7 +3880,7 @@
                   <pic:spPr>
                     <a:xfrm>
                       <a:off x="0" y="0"/>
-                      <a:ext cx="5486400" cy="3198585"/>
+                      <a:ext cx="5486400" cy="3197247"/>
                     </a:xfrm>
                     <a:prstGeom prst="rect"/>
                   </pic:spPr>
@@ -4765,7 +4765,7 @@
       <w:r>
         <w:drawing>
           <wp:inline xmlns:a="http://schemas.openxmlformats.org/drawingml/2006/main" xmlns:pic="http://schemas.openxmlformats.org/drawingml/2006/picture">
-            <wp:extent cx="5486400" cy="2256937"/>
+            <wp:extent cx="5486400" cy="2255100"/>
             <wp:docPr id="9" name="Picture 9"/>
             <wp:cNvGraphicFramePr>
               <a:graphicFrameLocks noChangeAspect="1"/>
@@ -4774,7 +4774,7 @@
               <a:graphicData uri="http://schemas.openxmlformats.org/drawingml/2006/picture">
                 <pic:pic>
                   <pic:nvPicPr>
-                    <pic:cNvPr id="0" name="w3_movie_10_dendrogram.png"/>
+                    <pic:cNvPr id="0" name="image.jpg"/>
                     <pic:cNvPicPr/>
                   </pic:nvPicPr>
                   <pic:blipFill>
@@ -4786,7 +4786,7 @@
                   <pic:spPr>
                     <a:xfrm>
                       <a:off x="0" y="0"/>
-                      <a:ext cx="5486400" cy="2256937"/>
+                      <a:ext cx="5486400" cy="2255100"/>
                     </a:xfrm>
                     <a:prstGeom prst="rect"/>
                   </pic:spPr>
@@ -4839,7 +4839,7 @@
       <w:r>
         <w:drawing>
           <wp:inline xmlns:a="http://schemas.openxmlformats.org/drawingml/2006/main" xmlns:pic="http://schemas.openxmlformats.org/drawingml/2006/picture">
-            <wp:extent cx="5486400" cy="2256937"/>
+            <wp:extent cx="5486400" cy="2255100"/>
             <wp:docPr id="10" name="Picture 10"/>
             <wp:cNvGraphicFramePr>
               <a:graphicFrameLocks noChangeAspect="1"/>
@@ -4848,7 +4848,7 @@
               <a:graphicData uri="http://schemas.openxmlformats.org/drawingml/2006/picture">
                 <pic:pic>
                   <pic:nvPicPr>
-                    <pic:cNvPr id="0" name="w3_tv_10_dendrogram.png"/>
+                    <pic:cNvPr id="0" name="image.jpg"/>
                     <pic:cNvPicPr/>
                   </pic:nvPicPr>
                   <pic:blipFill>
@@ -4860,7 +4860,7 @@
                   <pic:spPr>
                     <a:xfrm>
                       <a:off x="0" y="0"/>
-                      <a:ext cx="5486400" cy="2256937"/>
+                      <a:ext cx="5486400" cy="2255100"/>
                     </a:xfrm>
                     <a:prstGeom prst="rect"/>
                   </pic:spPr>
@@ -4941,7 +4941,7 @@
       <w:r>
         <w:drawing>
           <wp:inline xmlns:a="http://schemas.openxmlformats.org/drawingml/2006/main" xmlns:pic="http://schemas.openxmlformats.org/drawingml/2006/picture">
-            <wp:extent cx="5486400" cy="3524794"/>
+            <wp:extent cx="5486400" cy="3526431"/>
             <wp:docPr id="11" name="Picture 11"/>
             <wp:cNvGraphicFramePr>
               <a:graphicFrameLocks noChangeAspect="1"/>
@@ -4950,7 +4950,7 @@
               <a:graphicData uri="http://schemas.openxmlformats.org/drawingml/2006/picture">
                 <pic:pic>
                   <pic:nvPicPr>
-                    <pic:cNvPr id="0" name="w3_movie_05_pca.png"/>
+                    <pic:cNvPr id="0" name="image.jpg"/>
                     <pic:cNvPicPr/>
                   </pic:nvPicPr>
                   <pic:blipFill>
@@ -4962,7 +4962,7 @@
                   <pic:spPr>
                     <a:xfrm>
                       <a:off x="0" y="0"/>
-                      <a:ext cx="5486400" cy="3524794"/>
+                      <a:ext cx="5486400" cy="3526431"/>
                     </a:xfrm>
                     <a:prstGeom prst="rect"/>
                   </pic:spPr>
@@ -5015,7 +5015,7 @@
       <w:r>
         <w:drawing>
           <wp:inline xmlns:a="http://schemas.openxmlformats.org/drawingml/2006/main" xmlns:pic="http://schemas.openxmlformats.org/drawingml/2006/picture">
-            <wp:extent cx="5486400" cy="3524794"/>
+            <wp:extent cx="5486400" cy="3526431"/>
             <wp:docPr id="12" name="Picture 12"/>
             <wp:cNvGraphicFramePr>
               <a:graphicFrameLocks noChangeAspect="1"/>
@@ -5024,7 +5024,7 @@
               <a:graphicData uri="http://schemas.openxmlformats.org/drawingml/2006/picture">
                 <pic:pic>
                   <pic:nvPicPr>
-                    <pic:cNvPr id="0" name="w3_tv_05_pca.png"/>
+                    <pic:cNvPr id="0" name="image.jpg"/>
                     <pic:cNvPicPr/>
                   </pic:nvPicPr>
                   <pic:blipFill>
@@ -5036,7 +5036,7 @@
                   <pic:spPr>
                     <a:xfrm>
                       <a:off x="0" y="0"/>
-                      <a:ext cx="5486400" cy="3524794"/>
+                      <a:ext cx="5486400" cy="3526431"/>
                     </a:xfrm>
                     <a:prstGeom prst="rect"/>
                   </pic:spPr>
@@ -5089,7 +5089,7 @@
       <w:r>
         <w:drawing>
           <wp:inline xmlns:a="http://schemas.openxmlformats.org/drawingml/2006/main" xmlns:pic="http://schemas.openxmlformats.org/drawingml/2006/picture">
-            <wp:extent cx="5486400" cy="2086960"/>
+            <wp:extent cx="5486400" cy="2088616"/>
             <wp:docPr id="13" name="Picture 13"/>
             <wp:cNvGraphicFramePr>
               <a:graphicFrameLocks noChangeAspect="1"/>
@@ -5098,7 +5098,7 @@
               <a:graphicData uri="http://schemas.openxmlformats.org/drawingml/2006/picture">
                 <pic:pic>
                   <pic:nvPicPr>
-                    <pic:cNvPr id="0" name="w3_movie_06_centroids.png"/>
+                    <pic:cNvPr id="0" name="image.jpg"/>
                     <pic:cNvPicPr/>
                   </pic:nvPicPr>
                   <pic:blipFill>
@@ -5110,7 +5110,7 @@
                   <pic:spPr>
                     <a:xfrm>
                       <a:off x="0" y="0"/>
-                      <a:ext cx="5486400" cy="2086960"/>
+                      <a:ext cx="5486400" cy="2088616"/>
                     </a:xfrm>
                     <a:prstGeom prst="rect"/>
                   </pic:spPr>
@@ -5163,7 +5163,7 @@
       <w:r>
         <w:drawing>
           <wp:inline xmlns:a="http://schemas.openxmlformats.org/drawingml/2006/main" xmlns:pic="http://schemas.openxmlformats.org/drawingml/2006/picture">
-            <wp:extent cx="5486400" cy="2088791"/>
+            <wp:extent cx="5486400" cy="2088616"/>
             <wp:docPr id="14" name="Picture 14"/>
             <wp:cNvGraphicFramePr>
               <a:graphicFrameLocks noChangeAspect="1"/>
@@ -5172,7 +5172,7 @@
               <a:graphicData uri="http://schemas.openxmlformats.org/drawingml/2006/picture">
                 <pic:pic>
                   <pic:nvPicPr>
-                    <pic:cNvPr id="0" name="w3_tv_06_centroids.png"/>
+                    <pic:cNvPr id="0" name="image.jpg"/>
                     <pic:cNvPicPr/>
                   </pic:nvPicPr>
                   <pic:blipFill>
@@ -5184,7 +5184,7 @@
                   <pic:spPr>
                     <a:xfrm>
                       <a:off x="0" y="0"/>
-                      <a:ext cx="5486400" cy="2088791"/>
+                      <a:ext cx="5486400" cy="2088616"/>
                     </a:xfrm>
                     <a:prstGeom prst="rect"/>
                   </pic:spPr>
@@ -5237,7 +5237,7 @@
       <w:r>
         <w:drawing>
           <wp:inline xmlns:a="http://schemas.openxmlformats.org/drawingml/2006/main" xmlns:pic="http://schemas.openxmlformats.org/drawingml/2006/picture">
-            <wp:extent cx="5486400" cy="1938963"/>
+            <wp:extent cx="5486400" cy="1937267"/>
             <wp:docPr id="15" name="Picture 15"/>
             <wp:cNvGraphicFramePr>
               <a:graphicFrameLocks noChangeAspect="1"/>
@@ -5246,7 +5246,7 @@
               <a:graphicData uri="http://schemas.openxmlformats.org/drawingml/2006/picture">
                 <pic:pic>
                   <pic:nvPicPr>
-                    <pic:cNvPr id="0" name="w3_movie_07_boxplots.png"/>
+                    <pic:cNvPr id="0" name="image.jpg"/>
                     <pic:cNvPicPr/>
                   </pic:nvPicPr>
                   <pic:blipFill>
@@ -5258,7 +5258,7 @@
                   <pic:spPr>
                     <a:xfrm>
                       <a:off x="0" y="0"/>
-                      <a:ext cx="5486400" cy="1938963"/>
+                      <a:ext cx="5486400" cy="1937267"/>
                     </a:xfrm>
                     <a:prstGeom prst="rect"/>
                   </pic:spPr>
@@ -5311,7 +5311,7 @@
       <w:r>
         <w:drawing>
           <wp:inline xmlns:a="http://schemas.openxmlformats.org/drawingml/2006/main" xmlns:pic="http://schemas.openxmlformats.org/drawingml/2006/picture">
-            <wp:extent cx="5486400" cy="1938462"/>
+            <wp:extent cx="5486400" cy="1937267"/>
             <wp:docPr id="16" name="Picture 16"/>
             <wp:cNvGraphicFramePr>
               <a:graphicFrameLocks noChangeAspect="1"/>
@@ -5320,7 +5320,7 @@
               <a:graphicData uri="http://schemas.openxmlformats.org/drawingml/2006/picture">
                 <pic:pic>
                   <pic:nvPicPr>
-                    <pic:cNvPr id="0" name="w3_tv_07_boxplots.png"/>
+                    <pic:cNvPr id="0" name="image.jpg"/>
                     <pic:cNvPicPr/>
                   </pic:nvPicPr>
                   <pic:blipFill>
@@ -5332,7 +5332,7 @@
                   <pic:spPr>
                     <a:xfrm>
                       <a:off x="0" y="0"/>
-                      <a:ext cx="5486400" cy="1938462"/>
+                      <a:ext cx="5486400" cy="1937267"/>
                     </a:xfrm>
                     <a:prstGeom prst="rect"/>
                   </pic:spPr>
@@ -5385,7 +5385,7 @@
       <w:r>
         <w:drawing>
           <wp:inline xmlns:a="http://schemas.openxmlformats.org/drawingml/2006/main" xmlns:pic="http://schemas.openxmlformats.org/drawingml/2006/picture">
-            <wp:extent cx="5486400" cy="3199855"/>
+            <wp:extent cx="5486400" cy="3201031"/>
             <wp:docPr id="17" name="Picture 17"/>
             <wp:cNvGraphicFramePr>
               <a:graphicFrameLocks noChangeAspect="1"/>
@@ -5394,7 +5394,7 @@
               <a:graphicData uri="http://schemas.openxmlformats.org/drawingml/2006/picture">
                 <pic:pic>
                   <pic:nvPicPr>
-                    <pic:cNvPr id="0" name="w3_movie_08_audience.png"/>
+                    <pic:cNvPr id="0" name="image.jpg"/>
                     <pic:cNvPicPr/>
                   </pic:nvPicPr>
                   <pic:blipFill>
@@ -5406,7 +5406,7 @@
                   <pic:spPr>
                     <a:xfrm>
                       <a:off x="0" y="0"/>
-                      <a:ext cx="5486400" cy="3199855"/>
+                      <a:ext cx="5486400" cy="3201031"/>
                     </a:xfrm>
                     <a:prstGeom prst="rect"/>
                   </pic:spPr>
@@ -5459,7 +5459,7 @@
       <w:r>
         <w:drawing>
           <wp:inline xmlns:a="http://schemas.openxmlformats.org/drawingml/2006/main" xmlns:pic="http://schemas.openxmlformats.org/drawingml/2006/picture">
-            <wp:extent cx="5486400" cy="2319776"/>
+            <wp:extent cx="5486400" cy="2319423"/>
             <wp:docPr id="18" name="Picture 18"/>
             <wp:cNvGraphicFramePr>
               <a:graphicFrameLocks noChangeAspect="1"/>
@@ -5468,7 +5468,7 @@
               <a:graphicData uri="http://schemas.openxmlformats.org/drawingml/2006/picture">
                 <pic:pic>
                   <pic:nvPicPr>
-                    <pic:cNvPr id="0" name="w3_movie_09_genres.png"/>
+                    <pic:cNvPr id="0" name="image.jpg"/>
                     <pic:cNvPicPr/>
                   </pic:nvPicPr>
                   <pic:blipFill>
@@ -5480,7 +5480,7 @@
                   <pic:spPr>
                     <a:xfrm>
                       <a:off x="0" y="0"/>
-                      <a:ext cx="5486400" cy="2319776"/>
+                      <a:ext cx="5486400" cy="2319423"/>
                     </a:xfrm>
                     <a:prstGeom prst="rect"/>
                   </pic:spPr>
@@ -5533,7 +5533,7 @@
       <w:r>
         <w:drawing>
           <wp:inline xmlns:a="http://schemas.openxmlformats.org/drawingml/2006/main" xmlns:pic="http://schemas.openxmlformats.org/drawingml/2006/picture">
-            <wp:extent cx="5486400" cy="3199855"/>
+            <wp:extent cx="5486400" cy="3201031"/>
             <wp:docPr id="19" name="Picture 19"/>
             <wp:cNvGraphicFramePr>
               <a:graphicFrameLocks noChangeAspect="1"/>
@@ -5542,7 +5542,7 @@
               <a:graphicData uri="http://schemas.openxmlformats.org/drawingml/2006/picture">
                 <pic:pic>
                   <pic:nvPicPr>
-                    <pic:cNvPr id="0" name="w3_tv_08_audience.png"/>
+                    <pic:cNvPr id="0" name="image.jpg"/>
                     <pic:cNvPicPr/>
                   </pic:nvPicPr>
                   <pic:blipFill>
@@ -5554,7 +5554,7 @@
                   <pic:spPr>
                     <a:xfrm>
                       <a:off x="0" y="0"/>
-                      <a:ext cx="5486400" cy="3199855"/>
+                      <a:ext cx="5486400" cy="3201031"/>
                     </a:xfrm>
                     <a:prstGeom prst="rect"/>
                   </pic:spPr>
@@ -5607,7 +5607,7 @@
       <w:r>
         <w:drawing>
           <wp:inline xmlns:a="http://schemas.openxmlformats.org/drawingml/2006/main" xmlns:pic="http://schemas.openxmlformats.org/drawingml/2006/picture">
-            <wp:extent cx="5486400" cy="2320042"/>
+            <wp:extent cx="5486400" cy="2319423"/>
             <wp:docPr id="20" name="Picture 20"/>
             <wp:cNvGraphicFramePr>
               <a:graphicFrameLocks noChangeAspect="1"/>
@@ -5616,7 +5616,7 @@
               <a:graphicData uri="http://schemas.openxmlformats.org/drawingml/2006/picture">
                 <pic:pic>
                   <pic:nvPicPr>
-                    <pic:cNvPr id="0" name="w3_tv_09_genres.png"/>
+                    <pic:cNvPr id="0" name="image.jpg"/>
                     <pic:cNvPicPr/>
                   </pic:nvPicPr>
                   <pic:blipFill>
@@ -5628,7 +5628,7 @@
                   <pic:spPr>
                     <a:xfrm>
                       <a:off x="0" y="0"/>
-                      <a:ext cx="5486400" cy="2320042"/>
+                      <a:ext cx="5486400" cy="2319423"/>
                     </a:xfrm>
                     <a:prstGeom prst="rect"/>
                   </pic:spPr>
@@ -5681,7 +5681,7 @@
       <w:r>
         <w:drawing>
           <wp:inline xmlns:a="http://schemas.openxmlformats.org/drawingml/2006/main" xmlns:pic="http://schemas.openxmlformats.org/drawingml/2006/picture">
-            <wp:extent cx="5486400" cy="3325963"/>
+            <wp:extent cx="5486400" cy="3325894"/>
             <wp:docPr id="21" name="Picture 21"/>
             <wp:cNvGraphicFramePr>
               <a:graphicFrameLocks noChangeAspect="1"/>
@@ -5690,7 +5690,7 @@
               <a:graphicData uri="http://schemas.openxmlformats.org/drawingml/2006/picture">
                 <pic:pic>
                   <pic:nvPicPr>
-                    <pic:cNvPr id="0" name="w3_movie_11_hier_pca.png"/>
+                    <pic:cNvPr id="0" name="image.jpg"/>
                     <pic:cNvPicPr/>
                   </pic:nvPicPr>
                   <pic:blipFill>
@@ -5702,7 +5702,7 @@
                   <pic:spPr>
                     <a:xfrm>
                       <a:off x="0" y="0"/>
-                      <a:ext cx="5486400" cy="3325963"/>
+                      <a:ext cx="5486400" cy="3325894"/>
                     </a:xfrm>
                     <a:prstGeom prst="rect"/>
                   </pic:spPr>
@@ -5755,7 +5755,7 @@
       <w:r>
         <w:drawing>
           <wp:inline xmlns:a="http://schemas.openxmlformats.org/drawingml/2006/main" xmlns:pic="http://schemas.openxmlformats.org/drawingml/2006/picture">
-            <wp:extent cx="5486400" cy="2361384"/>
+            <wp:extent cx="5486400" cy="2361044"/>
             <wp:docPr id="22" name="Picture 22"/>
             <wp:cNvGraphicFramePr>
               <a:graphicFrameLocks noChangeAspect="1"/>
@@ -5764,7 +5764,7 @@
               <a:graphicData uri="http://schemas.openxmlformats.org/drawingml/2006/picture">
                 <pic:pic>
                   <pic:nvPicPr>
-                    <pic:cNvPr id="0" name="w3_compare_01_method_silhouette.png"/>
+                    <pic:cNvPr id="0" name="image.jpg"/>
                     <pic:cNvPicPr/>
                   </pic:nvPicPr>
                   <pic:blipFill>
@@ -5776,7 +5776,7 @@
                   <pic:spPr>
                     <a:xfrm>
                       <a:off x="0" y="0"/>
-                      <a:ext cx="5486400" cy="2361384"/>
+                      <a:ext cx="5486400" cy="2361044"/>
                     </a:xfrm>
                     <a:prstGeom prst="rect"/>
                   </pic:spPr>
@@ -5829,7 +5829,7 @@
       <w:r>
         <w:drawing>
           <wp:inline xmlns:a="http://schemas.openxmlformats.org/drawingml/2006/main" xmlns:pic="http://schemas.openxmlformats.org/drawingml/2006/picture">
-            <wp:extent cx="5486400" cy="3052375"/>
+            <wp:extent cx="5486400" cy="3053465"/>
             <wp:docPr id="23" name="Picture 23"/>
             <wp:cNvGraphicFramePr>
               <a:graphicFrameLocks noChangeAspect="1"/>
@@ -5838,7 +5838,7 @@
               <a:graphicData uri="http://schemas.openxmlformats.org/drawingml/2006/picture">
                 <pic:pic>
                   <pic:nvPicPr>
-                    <pic:cNvPr id="0" name="w3_compare_02_ari.png"/>
+                    <pic:cNvPr id="0" name="image.jpg"/>
                     <pic:cNvPicPr/>
                   </pic:nvPicPr>
                   <pic:blipFill>
@@ -5850,7 +5850,7 @@
                   <pic:spPr>
                     <a:xfrm>
                       <a:off x="0" y="0"/>
-                      <a:ext cx="5486400" cy="3052375"/>
+                      <a:ext cx="5486400" cy="3053465"/>
                     </a:xfrm>
                     <a:prstGeom prst="rect"/>
                   </pic:spPr>

</xml_diff>